<commit_message>
Fuel price update 2026-10-14 — Campania spotlight
</commit_message>
<xml_diff>
--- a/slides/article-2026-10-14.docx
+++ b/slides/article-2026-10-14.docx
@@ -31,7 +31,7 @@
           <w:sz w:val="60"/>
           <w:szCs w:val="60"/>
         </w:rPr>
-        <w:t xml:space="preserve">Campania Pulls Back From Its September Fuel-Price Peak While Metano's National Rally Outpaces It</w:t>
+        <w:t xml:space="preserve">Campania's Metano Prices Are Pulling Away From the Rest of Italy</w:t>
       </w:r>
     </w:p>
     <w:p>
@@ -49,7 +49,7 @@
           <w:sz w:val="24"/>
           <w:szCs w:val="24"/>
         </w:rPr>
-        <w:t xml:space="preserve">Benzina and Gasolio have eased off their late-September highs across Campania, GPL is quietly climbing to new recent highs, and Metano keeps rising everywhere — just noticeably slower here than nationally.</w:t>
+        <w:t xml:space="preserve">A look at today's pump prices in Campania alongside twelve weeks of regional data reveals a fuel-by-fuel split: methane has decoupled from the national trend, while gasoline and diesel have quietly turned from a regional discount into a premium.</w:t>
       </w:r>
     </w:p>
     <w:tbl>
@@ -385,7 +385,7 @@
           <w:sz w:val="22"/>
           <w:szCs w:val="22"/>
         </w:rPr>
-        <w:t xml:space="preserve">As of October 13, 2026, self-service drivers in Campania are paying €2.0672/L for Benzina, €2.2887/L for Gasolio, €0.7414/L for GPL, and €1.7615/L for Metano. Benzina and Gasolio both ticked up slightly from two days earlier (October 11), by 0.06% and 0.11% respectively, while GPL and Metano held perfectly flat day-over-day. Nationally the picture was almost a mirror image: Benzina and Gasolio each dipped marginally (-0.02% and -0.04%), while GPL and Metano both edged higher. Campania remains the pricier region for liquid fuels today — Benzina running 1.01% above the national average and Gasolio 0.63% above — but it is the cheaper region for gas-based fuels, with GPL running 4.10% below the national average and Metano a full 5.91% below it.</w:t>
+        <w:t xml:space="preserve">On October 13, 2026 — the most recent day in the Ministry's price feed — self-service Benzina in Campania averaged €2.0672/L, Gasolio €2.2887/L, GPL €0.7414/L and Metano €1.7615/L, across 1,844 of the region's 2,118 registered stations reporting that day. Benzina and Gasolio ticked up fractionally from two days earlier (+€0.0012 and +€0.0025 respectively), while GPL and Metano held exactly flat. Against the national same-day averages (€2.0465, €2.2744, €0.7731 and €1.8721/L respectively), Campania runs slightly above the rest of Italy on Benzina (+1.0%) and Gasolio (+0.6%), but sits meaningfully below the national average on GPL (-4.1%) and Metano (-5.9%).</w:t>
       </w:r>
     </w:p>
     <w:p>
@@ -403,7 +403,7 @@
           <w:sz w:val="22"/>
           <w:szCs w:val="22"/>
         </w:rPr>
-        <w:t xml:space="preserve">The more interesting story sits in the seven-day averages tracked since late July. All four fuels in Campania rose from late summer into a shared peak in the week of September 21 (2026-W39), then Benzina and Gasolio turned lower — down 4.66% and 3.38% respectively from that peak through the week of October 5 — while GPL and Metano kept climbing through the same stretch. The sharpest divergence, though, is in Metano itself: since the first fully-tracked week (2026-W31, starting July 27), Metano's self-service average has risen 16.10% in Campania but 22.68% nationally — a gap of more than six and a half points that has been widening steadily week after week. Campania is not just cheaper on Metano today; the gap between it and the rest of the country has been growing for over two months.</w:t>
+        <w:t xml:space="preserve">The day-to-day snapshot undersells what's actually been moving. Zooming out to the twelve weeks of history captured since July 21, 2026, the standout story is Metano: it has climbed 16.4% in Campania but a much steeper 24.8% nationally, widening what started the summer as a fuel priced roughly at parity with the rest of Italy into a gap of almost 6%. Benzina and Gasolio tell a quieter but arguably more consequential story — both fuels have fallen from their late-September peaks, but Campania's declines have lagged the national pace, flipping the region from pricing very slightly below the national average in July to running above it on both fuels today.</w:t>
       </w:r>
     </w:p>
     <w:p>
@@ -422,7 +422,7 @@
           <w:sz w:val="30"/>
           <w:szCs w:val="30"/>
         </w:rPr>
-        <w:t xml:space="preserve">Metano has climbed 23.37% nationally since late July — but in Campania the same fuel has risen only 16.43%, a gap that has widened every single week for eleven straight weeks.</w:t>
+        <w:t xml:space="preserve">Metano prices have risen nearly 25% nationally since late July — but only 16% in Campania, widening a discount that didn't even exist twelve weeks ago.</w:t>
       </w:r>
     </w:p>
     <w:p>
@@ -459,7 +459,7 @@
           <w:sz w:val="34"/>
           <w:szCs w:val="34"/>
         </w:rPr>
-        <w:t xml:space="preserve">Benzina Eases Off Its September High, and More Gently Than the National Average</w:t>
+        <w:t xml:space="preserve">Benzina: A Slower Retreat From September's Peak</w:t>
       </w:r>
     </w:p>
     <w:tbl>
@@ -740,7 +740,7 @@
           <w:sz w:val="22"/>
           <w:szCs w:val="22"/>
         </w:rPr>
-        <w:t xml:space="preserve">Self-service Benzina in Campania closed at €2.0672/L on October 13, up a marginal 0.06% from €2.066/L two days earlier. That nudges it further above the national self-service average of €2.0465/L, a gap of 1.01% — Campania has been the pricier region for petrol for most of the tracked period, and today is no exception. Nationally, Benzina actually slipped slightly over the same two days, from €2.0468/L to €2.0465/L (-0.02%), meaning the region and the country moved in opposite directions, even if both moves were tiny.</w:t>
+        <w:t xml:space="preserve">Self-service Benzina in Campania closed at €2.0672/L on October 13, up a negligible €0.0012 (+0.06%) from October 11 — essentially flat. That puts Campania €0.0207 above the national self-service average of €2.0465/L, a 1.0% premium.</w:t>
       </w:r>
     </w:p>
     <w:p>
@@ -758,7 +758,7 @@
           <w:sz w:val="22"/>
           <w:szCs w:val="22"/>
         </w:rPr>
-        <w:t xml:space="preserve">Zoom out to the weekly averages and the real story is a round trip: Benzina in Campania rose from €1.9995/L in the week of July 27 (2026-W31) to a peak of €2.1650/L in the week of September 21 (2026-W39) — a climb of roughly 8.3% — before retreating to €2.0642/L by the week of October 5 (2026-W41), a pullback of 4.66% from the peak. Nationally the same round trip was sharper: the September 21 peak of €2.1669/L gave back 5.47% by October 5. In other words, Campania's petrol rallied slightly harder from July to September (+3.24% week-on-week vs. +2.27% nationally over the same span) but has also been pulling back a little more gently since — a small but consistent sign that this region's Benzina market is marginally stickier in both directions than the national average.</w:t>
+        <w:t xml:space="preserve">Across the twelve weeks tracked since 2026-W30 (week of July 20), Campania's Benzina rose from a weekly average of €1.9721/L to €2.0672/L, a +4.8% increase, slightly ahead of the national +3.6% gain over the same stretch. Both series peaked in week 2026-W39 (week of September 21) — Campania at €2.1650/L, Italy at €2.1669/L — before falling back; since that peak, Campania is down 4.5% versus a national drop of 5.6%. Because Campania's slide from the September highs has been shallower than the rest of the country's, the region has gone from pricing Benzina almost exactly at the national level in July to running about a cent above it today.</w:t>
       </w:r>
     </w:p>
     <w:p>
@@ -1764,7 +1764,7 @@
           <w:sz w:val="34"/>
           <w:szCs w:val="34"/>
         </w:rPr>
-        <w:t xml:space="preserve">Diesel's Retreat From a Record Tracked High Continues, Just Slower Than Nationally</w:t>
+        <w:t xml:space="preserve">Gasolio: The Same September Peak, a Slower Comedown</w:t>
       </w:r>
     </w:p>
     <w:tbl>
@@ -2045,7 +2045,7 @@
           <w:sz w:val="22"/>
           <w:szCs w:val="22"/>
         </w:rPr>
-        <w:t xml:space="preserve">Gasolio in Campania priced at €2.2887/L on October 13, up 0.11% from €2.2862/L on October 11 — the largest of the four day-over-day moves in either direction for the region today. That puts Campania 0.63% above the national self-service average of €2.2744/L, which itself edged down 0.04% over the same two days (from €2.2753/L). As with Benzina, the region ticked up while the country ticked down, a small divergence worth watching if it persists into next week's readings.</w:t>
+        <w:t xml:space="preserve">Gasolio in Campania averaged €2.2887/L self-service on October 13, up €0.0025 (+0.11%) from two days prior. That is €0.0143 above the national self-service average of €2.2744/L, a 0.6% premium, continuing the pattern seen in Benzina.</w:t>
       </w:r>
     </w:p>
     <w:p>
@@ -2063,7 +2063,7 @@
           <w:sz w:val="22"/>
           <w:szCs w:val="22"/>
         </w:rPr>
-        <w:t xml:space="preserve">The multi-week picture shows diesel followed almost exactly the same arc as petrol: from €2.1532/L in the week of July 27 (2026-W31) to the tracked-period peak of €2.3638/L in the week of September 21 (2026-W39) — a rise of 9.78% — before easing back to €2.2840/L by the week of October 5 (2026-W41), down 3.38% from that peak. Nationally, diesel rose further over the same build-up (+6.80% from W31 to W41, versus Campania's +6.07%) and has also fallen further from its peak (-3.89% versus Campania's -3.38%). The pattern repeats: Campania's diesel swings are consistently a touch smaller than the national swings, in both the run-up and the pullback.</w:t>
+        <w:t xml:space="preserve">Over the tracked weeks, Campania's Gasolio rose from €2.1774/L in 2026-W30 to €2.2887/L now, a +5.1% climb, versus +4.6% nationally — again a touch faster than the rest of Italy. Both series peaked in 2026-W39 (Campania €2.3638/L, Italy €2.3736/L) before easing off; Campania's retreat since then has been 3.2%, shallower than the national 4.2% pullback. The net effect mirrors Benzina: Campania's Gasolio dipped slightly below the national average in mid-summer (as much as 0.1% below in 2026-W33) but has since crossed over to a small premium, a sign the region's diesel prices are coming down more slowly than the national average even as both move in the same direction.</w:t>
       </w:r>
     </w:p>
     <w:p>
@@ -3069,7 +3069,7 @@
           <w:sz w:val="34"/>
           <w:szCs w:val="34"/>
         </w:rPr>
-        <w:t xml:space="preserve">GPL Quietly Climbs to Its Highest Level of the Tracked Period</w:t>
+        <w:t xml:space="preserve">GPL: Campania's Steadiest Discount, Now Narrowing</w:t>
       </w:r>
     </w:p>
     <w:tbl>
@@ -3350,7 +3350,7 @@
           <w:sz w:val="22"/>
           <w:szCs w:val="22"/>
         </w:rPr>
-        <w:t xml:space="preserve">GPL held flat in Campania at €0.7414/L on both October 11 and October 13 — the only fuel with zero day-over-day movement in the region. Nationally, GPL inched up 0.03% to €0.7731/L. That keeps Campania as the cheaper region for GPL by a wide margin: €0.7414/L versus €0.7731/L nationally, a 4.10% discount that has been a consistent feature of this region's gas-fuel pricing throughout the tracked period.</w:t>
+        <w:t xml:space="preserve">GPL held exactly flat day-over-day at €0.7414/L self-service. It remains Campania's biggest discount to the rest of the country: €0.0317 below the national self-service average of €0.7731/L, a gap of 4.1%.</w:t>
       </w:r>
     </w:p>
     <w:p>
@@ -3368,7 +3368,7 @@
           <w:sz w:val="22"/>
           <w:szCs w:val="22"/>
         </w:rPr>
-        <w:t xml:space="preserve">GPL's real story is its quiet climb off a long plateau. After bottoming around €0.7119/L in Campania through the weeks of August 31, September 14 and September 21 (2026-W36, W38 and W39), it has since risen to €0.7335/L by the week of October 5 (2026-W41) — up 3.03% off that floor — and further still to today's €0.7414/L, a cumulative 4.14% rise from the low. Nationally the same recovery has been more muted: from a floor of €0.7544/L in the week of August 31 (2026-W36) to €0.7731/L today, a 2.48% rise. Campania's GPL is cheaper in absolute terms, but it has been closing that gap faster than the national market has been moving — worth watching if the region keeps climbing at this pace.</w:t>
+        <w:t xml:space="preserve">GPL was the most stable of the four fuels in Campania for most of the tracked period, sitting in a tight €0.711-€0.720/L band from late July through late September while the national average drifted slowly upward — keeping Campania's discount in a fairly consistent range, as wide as 5.4% below national back in 2026-W30. That changed in the last two weeks: Campania GPL jumped from a weekly average of €0.7150/L in 2026-W40 to €0.7414/L in 2026-W42, a +3.7% rise in a fortnight, actually outpacing the national move of +2.2% over the same two weeks. The result is a discount that has narrowed from roughly 5.4% at the start of the tracked history to 4.1% now — still Campania's largest fuel discount versus Italy, but a smaller one than it used to be.</w:t>
       </w:r>
     </w:p>
     <w:p>
@@ -4374,7 +4374,7 @@
           <w:sz w:val="34"/>
           <w:szCs w:val="34"/>
         </w:rPr>
-        <w:t xml:space="preserve">Metano Keeps Rising Everywhere — Just Measurably Slower in Campania</w:t>
+        <w:t xml:space="preserve">Metano: The Fuel Where Campania and Italy Have Gone Separate Ways</w:t>
       </w:r>
     </w:p>
     <w:tbl>
@@ -4655,7 +4655,7 @@
           <w:sz w:val="22"/>
           <w:szCs w:val="22"/>
         </w:rPr>
-        <w:t xml:space="preserve">Metano in Campania was unchanged day-over-day, holding at €1.7615/L on both October 11 and October 13. Nationally it rose 0.29%, from €1.8667/L to €1.8721/L — the largest single day-over-day move of any fuel nationally today. That widens Campania's discount on Metano to 5.91% below the national average, the single biggest regional-versus-national gap of any of the four fuels tracked.</w:t>
+        <w:t xml:space="preserve">Metano also sat flat day-over-day at €1.7615/L self-service, the widest gap to the national average of any fuel tracked today: €0.1106 below the national €1.8721/L, a 5.9% discount.</w:t>
       </w:r>
     </w:p>
     <w:p>
@@ -4673,7 +4673,7 @@
           <w:sz w:val="22"/>
           <w:szCs w:val="22"/>
         </w:rPr>
-        <w:t xml:space="preserve">This is also where the clearest trend divergence in today's data lives: Metano has risen every single tracked week since the week of July 27 (2026-W31) with no pullback at all, in both Campania and nationally — but at very different speeds. Campania's self-service average has gone from €1.5129/L to today's €1.7615/L, a rise of 16.43%. Nationally, the same fuel has gone from €1.5175/L to €1.8721/L, a rise of 23.37%. That's a gap of nearly seven percentage points that has opened up gradually, week after week, since late July — Campania is not just cheaper on Metano, it is also rising more slowly, and the gap between the two has not closed once in the eleven weeks of data collected so far.</w:t>
+        <w:t xml:space="preserve">This is the most dramatic multi-week story in the data. Campania's Metano started the tracked period in 2026-W30 at €1.5129/L, actually a touch above the national €1.4999/L (+0.9%). From there, both climbed, but national Metano accelerated hard through August and September, reaching €1.8721/L by 2026-W42 — a +24.8% rise — while Campania's own climb, though still substantial at +16.4% to €1.7615/L, was noticeably more moderate. The gap between the two widened steadily through the period, bottoming out around 6.4% below national in late September (2026-W39) before easing slightly to today's 5.9%. Metano is the one fuel where Campania has clearly decoupled from the national trend rather than tracking it with a small, steady offset, as Benzina, Gasolio and GPL all do.</w:t>
       </w:r>
     </w:p>
     <w:p>
@@ -5679,7 +5679,7 @@
           <w:sz w:val="34"/>
           <w:szCs w:val="34"/>
         </w:rPr>
-        <w:t xml:space="preserve">Station Coverage Dips Slightly as Campania's Reporting Rate Trails the National Average</w:t>
+        <w:t xml:space="preserve">Station Coverage: 1,844 of 2,118 Pumps Reporting</w:t>
       </w:r>
     </w:p>
     <w:p>
@@ -5697,7 +5697,7 @@
           <w:sz w:val="22"/>
           <w:szCs w:val="22"/>
         </w:rPr>
-        <w:t xml:space="preserve">Campania has 2,118 registered stations as of today, with 1,844 of them reporting a price today — a reporting rate of 87.06%. That's down slightly from 87.29% two days ago (1,848 of 2,117 registered stations reporting on October 11), a small dip worth noting but not yet a trend on its own.</w:t>
+        <w:t xml:space="preserve">Campania's registry lists 2,118 fuel stations, of which 1,844 reported a price on October 13 — a reporting rate of 87.1%. That is down slightly from 87.3% two days earlier, as the registered count ticked up by one station (2,117 to 2,118) while reporting dipped by four (1,848 to 1,844).</w:t>
       </w:r>
     </w:p>
     <w:p>
@@ -5715,7 +5715,7 @@
           <w:sz w:val="22"/>
           <w:szCs w:val="22"/>
         </w:rPr>
-        <w:t xml:space="preserve">Nationally, 21,631 of 23,929 registered stations reported today, a reporting rate of 90.40% — meaning Campania's network is reporting at a rate roughly 3.3 points below the national average. A lower reporting rate doesn't change the prices shown here (which are averaged only over stations that did report), but it's a useful caveat: Campania's daily figures rest on a slightly smaller share of its total station network than the national figures do.</w:t>
+        <w:t xml:space="preserve">Nationally, 21,631 of 23,929 registered stations reported that day, a 90.4% rate — about three and a half points higher than Campania's. A gap of that size is typical day-to-day noise in MIMIT's reporting pipeline rather than a sign of a shrinking network; the region's registered count has been essentially stable all period, moving only between 2,114 and 2,123 stations since July 21, so Campania's lower-than-average reporting rate looks like a station-level timeliness issue rather than stations closing.</w:t>
       </w:r>
     </w:p>
     <w:p>
@@ -5752,7 +5752,7 @@
           <w:sz w:val="34"/>
           <w:szCs w:val="34"/>
         </w:rPr>
-        <w:t xml:space="preserve">How This Report Gets Made: Zero Manual Steps, Every Single Day</w:t>
+        <w:t xml:space="preserve">How This Report Gets Made</w:t>
       </w:r>
     </w:p>
     <w:p>
@@ -5770,7 +5770,7 @@
           <w:sz w:val="22"/>
           <w:szCs w:val="22"/>
         </w:rPr>
-        <w:t xml:space="preserve">Every part of this report — the underlying price and station data, the region-of-the-day rotation, the week-by-week trend analysis, and the prose itself — is produced automatically each morning by an unattended pipeline built with Claude Code. The pipeline pulls the latest MIMIT fuel-price and station-registry feeds, recomputes national and regional weekly averages, deterministically rotates through all twenty of Italy's regions so each one gets its turn in the spotlight, and then has an AI model read the resulting numbers and write up what changed and why it matters — all before a human has looked at a single row of data.</w:t>
+        <w:t xml:space="preserve">Every figure in this report — today's prices, the day-over-day deltas, the national comparisons, and the twelve-week trend analysis — comes directly from the Italian Ministry of Enterprises (MIMIT)'s open fuel-price feed, pulled fresh each morning by an unattended Python pipeline and written to a structured dataset. The region featured each day rotates deterministically through all twenty Italian regions in alphabetical order, keyed to the calendar date rather than chosen by a person, so every region gets equal and predictable coverage over a twenty-day cycle.</w:t>
       </w:r>
     </w:p>
     <w:p>
@@ -5788,7 +5788,7 @@
           <w:sz w:val="22"/>
           <w:szCs w:val="22"/>
         </w:rPr>
-        <w:t xml:space="preserve">That stands in sharp contrast to the traditional approach to this kind of tracking: a manually-maintained spreadsheet, updated by hand whenever someone remembers to download the latest CSV, with charts that have to be rebuilt and commentary that has to be rewritten from scratch every time. This report is generated, checked against source figures, and published the same way every day — which is also why every number cited above is pulled directly from the day's dataset rather than estimated or carried over from a previous write-up.</w:t>
+        <w:t xml:space="preserve">The analysis above, the written sections, the Word report, and the LinkedIn post accompanying it are all generated automatically by Claude Code, Anthropic's coding agent, reading the day's numbers and writing them up without a human in the loop. That is a different model from a manually maintained spreadsheet: there is no copy-paste, no stale tab from last month, and no risk of a transcription error creeping into a formula, because the same automated step that fetches the data is the one that writes about it. The tradeoff is that nobody proofreads the prose before it publishes — which is also why this report leans on citing exact figures from the dataset rather than rounding or guessing.</w:t>
       </w:r>
     </w:p>
     <w:p>
@@ -5825,7 +5825,7 @@
           <w:sz w:val="34"/>
           <w:szCs w:val="34"/>
         </w:rPr>
-        <w:t xml:space="preserve">Explore Beyond Agip Eni's Brand View</w:t>
+        <w:t xml:space="preserve">Explore Further on the Live Dashboard</w:t>
       </w:r>
     </w:p>
     <w:p>
@@ -5843,7 +5843,7 @@
           <w:sz w:val="22"/>
           <w:szCs w:val="22"/>
         </w:rPr>
-        <w:t xml:space="preserve">The live Fuel Dashboard opens by default on Agip Eni's brand-level view, but that's just the starting point. Use the scope picker to switch to Region, Province, Municipality, or any other Operator/Brand to see how prices and trends compare across the rest of Italy's fuel market — including today's featured region, Campania, and the national trends referenced throughout this report.</w:t>
+        <w:t xml:space="preserve">The interactive Fuel Dashboard behind this report opens by default on Agip Eni's brand-level view, but that is just a starting point. Use the scope picker to switch to Region to see Campania (or any other region) on its own, to Province or Municipality for a more local view, or to another Operator/Brand to compare pricing across Italy's fuel retailers — the same underlying twelve weeks of data that produced this report is there to explore interactively at your own pace.</w:t>
       </w:r>
     </w:p>
     <w:p>

</xml_diff>